<commit_message>
Record last week's workflow, template, trigger-link, and training updates
These changes were completed last week and are only being committed now.
</commit_message>
<xml_diff>
--- a/TrainingDocs/00-Start-Here.docx
+++ b/TrainingDocs/00-Start-Here.docx
@@ -1,6 +1,6 @@
 
 <file path=word/document.xml><?xml version="1.0" encoding="utf-8"?>
-<w:document xmlns:wpc="http://schemas.microsoft.com/office/word/2010/wordprocessingCanvas" xmlns:mc="http://schemas.openxmlformats.org/markup-compatibility/2006" xmlns:o="urn:schemas-microsoft-com:office:office" xmlns:r="http://schemas.openxmlformats.org/officeDocument/2006/relationships" xmlns:m="http://schemas.openxmlformats.org/officeDocument/2006/math" xmlns:v="urn:schemas-microsoft-com:vml" xmlns:wp14="http://schemas.microsoft.com/office/word/2010/wordprocessingDrawing" xmlns:wp="http://schemas.openxmlformats.org/drawingml/2006/wordprocessingDrawing" xmlns:w10="urn:schemas-microsoft-com:office:word" xmlns:w="http://schemas.openxmlformats.org/wordprocessingml/2006/main" xmlns:w14="http://schemas.microsoft.com/office/word/2010/wordml" xmlns:wpg="http://schemas.microsoft.com/office/word/2010/wordprocessingGroup" xmlns:wpi="http://schemas.microsoft.com/office/word/2010/wordprocessingInk" xmlns:wne="http://schemas.microsoft.com/office/2006/wordml" xmlns:wps="http://schemas.microsoft.com/office/word/2010/wordprocessingShape" mc:Ignorable="w14 wp14">
+<w:document xmlns:wpc="http://schemas.microsoft.com/office/word/2010/wordprocessingCanvas" xmlns:mc="http://schemas.openxmlformats.org/markup-compatibility/2006" xmlns:o="urn:schemas-microsoft-com:office:office" xmlns:r="http://schemas.openxmlformats.org/officeDocument/2006/relationships" xmlns:m="http://schemas.openxmlformats.org/officeDocument/2006/math" xmlns:v="urn:schemas-microsoft-com:vml" xmlns:wp14="http://schemas.microsoft.com/office/word/2010/wordprocessingDrawing" xmlns:wp="http://schemas.openxmlformats.org/drawingml/2006/wordprocessingDrawing" xmlns:w10="urn:schemas-microsoft-com:office:word" xmlns:w="http://schemas.openxmlformats.org/wordprocessingml/2006/main" xmlns:w14="http://schemas.microsoft.com/office/word/2010/wordml" xmlns:wpg="http://schemas.microsoft.com/office/word/2010/wordprocessingGroup" xmlns:wpi="http://schemas.microsoft.com/office/word/2010/wordprocessingInk" xmlns:wne="http://schemas.microsoft.com/office/word/2006/wordml" xmlns:wps="http://schemas.microsoft.com/office/word/2010/wordprocessingShape" mc:Ignorable="w14 wp14">
   <w:body>
     <w:p>
       <w:pPr>
@@ -25,27 +25,32 @@
     <w:p/>
     <w:p>
       <w:r>
-        <w:t xml:space="preserve">1. `01-Pipeline-Training-Guide.md`</w:t>
-      </w:r>
-    </w:p>
-    <w:p>
-      <w:r>
-        <w:t xml:space="preserve">2. `02-Daily-Quick-Reference.md`</w:t>
-      </w:r>
-    </w:p>
-    <w:p>
-      <w:r>
-        <w:t xml:space="preserve">3. `03-MQL-and-Booking-Rules.md`</w:t>
-      </w:r>
-    </w:p>
-    <w:p>
-      <w:r>
-        <w:t xml:space="preserve">4. `04-Email-Open-Follow-Up-Process.md`</w:t>
-      </w:r>
-    </w:p>
-    <w:p>
-      <w:r>
-        <w:t xml:space="preserve">5. `05-Website-Visitor-Leads.md`</w:t>
+        <w:t xml:space="preserve">1. 01-Pipeline-Training-Guide.md</w:t>
+      </w:r>
+    </w:p>
+    <w:p>
+      <w:r>
+        <w:t xml:space="preserve">2. 02-Daily-Quick-Reference.md</w:t>
+      </w:r>
+    </w:p>
+    <w:p>
+      <w:r>
+        <w:t xml:space="preserve">3. 03-MQL-and-Booking-Rules.md</w:t>
+      </w:r>
+    </w:p>
+    <w:p>
+      <w:r>
+        <w:t xml:space="preserve">4. 04-Email-Open-Follow-Up-Process.md</w:t>
+      </w:r>
+    </w:p>
+    <w:p>
+      <w:r>
+        <w:t xml:space="preserve">5. 05-Website-Visitor-Leads.md</w:t>
+      </w:r>
+    </w:p>
+    <w:p>
+      <w:r>
+        <w:t xml:space="preserve">6. 06-GHL-Automations-Guide.md</w:t>
       </w:r>
     </w:p>
     <w:p/>
@@ -56,16 +61,28 @@
     </w:p>
     <w:p/>
     <w:p>
+      <w:pPr>
+        <w:pStyle w:val="ListBullet"/>
+        <w:ind w:left="720" w:hanging="360"/>
+      </w:pPr>
       <w:r>
         <w:t xml:space="preserve">• New sales hires</w:t>
       </w:r>
     </w:p>
     <w:p>
+      <w:pPr>
+        <w:pStyle w:val="ListBullet"/>
+        <w:ind w:left="720" w:hanging="360"/>
+      </w:pPr>
       <w:r>
         <w:t xml:space="preserve">• SDRs</w:t>
       </w:r>
     </w:p>
     <w:p>
+      <w:pPr>
+        <w:pStyle w:val="ListBullet"/>
+        <w:ind w:left="720" w:hanging="360"/>
+      </w:pPr>
       <w:r>
         <w:t xml:space="preserve">• Closers who use GHL every day</w:t>
       </w:r>
@@ -78,25 +95,97 @@
     </w:p>
     <w:p/>
     <w:p>
+      <w:pPr>
+        <w:pStyle w:val="ListBullet"/>
+        <w:ind w:left="720" w:hanging="360"/>
+      </w:pPr>
       <w:r>
         <w:t xml:space="preserve">• Learn the pipeline</w:t>
       </w:r>
     </w:p>
     <w:p>
+      <w:pPr>
+        <w:pStyle w:val="ListBullet"/>
+        <w:ind w:left="720" w:hanging="360"/>
+      </w:pPr>
       <w:r>
         <w:t xml:space="preserve">• Learn when a lead is ready for sales</w:t>
       </w:r>
     </w:p>
     <w:p>
+      <w:pPr>
+        <w:pStyle w:val="ListBullet"/>
+        <w:ind w:left="720" w:hanging="360"/>
+      </w:pPr>
       <w:r>
         <w:t xml:space="preserve">• Learn what tags and alerts matter</w:t>
       </w:r>
     </w:p>
     <w:p>
+      <w:pPr>
+        <w:pStyle w:val="ListBullet"/>
+      </w:pPr>
+      <w:r>
+        <w:t>Learn the website hero consent rule:</w:t>
+      </w:r>
+    </w:p>
+    <w:p>
+      <w:pPr>
+        <w:pStyle w:val="ListBullet"/>
+      </w:pPr>
+      <w:r>
+        <w:t>T&amp;C 1 = non-marketing SMS consent</w:t>
+      </w:r>
+    </w:p>
+    <w:p>
+      <w:pPr>
+        <w:pStyle w:val="ListBullet"/>
+      </w:pPr>
+      <w:r>
+        <w:t>T&amp;C 2 = marketing SMS consent</w:t>
+      </w:r>
+    </w:p>
+    <w:p>
+      <w:pPr>
+        <w:pStyle w:val="ListBullet"/>
+      </w:pPr>
+      <w:r>
+        <w:t>these are built-in GHL form consent elements, not separate contact custom fields</w:t>
+      </w:r>
+    </w:p>
+    <w:p>
+      <w:pPr>
+        <w:pStyle w:val="ListBullet"/>
+        <w:ind w:left="720" w:hanging="360"/>
+      </w:pPr>
       <w:r>
         <w:t xml:space="preserve">• Learn what to do each day in GHL</w:t>
       </w:r>
     </w:p>
+    <w:p>
+      <w:pPr>
+        <w:pStyle w:val="ListBullet"/>
+        <w:ind w:left="720" w:hanging="360"/>
+      </w:pPr>
+      <w:r>
+        <w:t>• Learn the regulated ads booking rule:</w:t>
+      </w:r>
+    </w:p>
+    <w:p>
+      <w:r>
+        <w:t>- only Regulated Ads On Social/Search / normalized keys regulated-ads or regulated-ads-on-social-search get SQL</w:t>
+      </w:r>
+    </w:p>
+    <w:p>
+      <w:r>
+        <w:t xml:space="preserve">- only that booking should trigger the #leads Slack alert</w:t>
+      </w:r>
+    </w:p>
+    <w:p>
+      <w:r>
+        <w:t xml:space="preserve">- only that booking should move or create the opportunity in Sales -&gt; Discovery Scheduled</w:t>
+      </w:r>
+    </w:p>
     <w:p/>
     <w:p>
       <w:r>
@@ -105,21 +194,37 @@
     </w:p>
     <w:p/>
     <w:p>
+      <w:pPr>
+        <w:pStyle w:val="ListBullet"/>
+        <w:ind w:left="720" w:hanging="360"/>
+      </w:pPr>
       <w:r>
         <w:t xml:space="preserve">• Deep technical setup</w:t>
       </w:r>
     </w:p>
     <w:p>
+      <w:pPr>
+        <w:pStyle w:val="ListBullet"/>
+        <w:ind w:left="720" w:hanging="360"/>
+      </w:pPr>
       <w:r>
         <w:t xml:space="preserve">• n8n build steps</w:t>
       </w:r>
     </w:p>
     <w:p>
+      <w:pPr>
+        <w:pStyle w:val="ListBullet"/>
+        <w:ind w:left="720" w:hanging="360"/>
+      </w:pPr>
       <w:r>
         <w:t xml:space="preserve">• API details</w:t>
       </w:r>
     </w:p>
     <w:p>
+      <w:pPr>
+        <w:pStyle w:val="ListBullet"/>
+        <w:ind w:left="720" w:hanging="360"/>
+      </w:pPr>
       <w:r>
         <w:t xml:space="preserve">• admin-only workflow wiring</w:t>
       </w:r>
@@ -132,18 +237,26 @@
     </w:p>
     <w:p/>
     <w:p>
+      <w:pPr>
+        <w:pStyle w:val="ListBullet"/>
+        <w:ind w:left="720" w:hanging="360"/>
+      </w:pPr>
       <w:r>
         <w:t xml:space="preserve">• If you are working a lead in GHL, use this folder first.</w:t>
       </w:r>
     </w:p>
     <w:p>
-      <w:r>
-        <w:t xml:space="preserve">• If you need backend or admin details, use the original docs in `GHL Live Transparent CRM`.</w:t>
+      <w:pPr>
+        <w:pStyle w:val="ListBullet"/>
+        <w:ind w:left="720" w:hanging="360"/>
+      </w:pPr>
+      <w:r>
+        <w:t xml:space="preserve">• If you need backend or admin details, use the original docs in GHL Live Transparent CRM.</w:t>
       </w:r>
     </w:p>
     <w:sectPr>
       <w:pgSz w:w="12240" w:h="15840"/>
-      <w:pgMar w:top="1440" w:right="1440" w:bottom="1440" w:left="1440" w:header="720" w:footer="720" w:gutter="0"/>
+      <w:pgMar w:top="1440" w:right="1440" w:bottom="1440" w:left="1440" w:header="708" w:footer="708" w:gutter="0"/>
     </w:sectPr>
   </w:body>
 </w:document>
@@ -151,42 +264,73 @@
 
 <file path=word/styles.xml><?xml version="1.0" encoding="utf-8"?>
 <w:styles xmlns:w="http://schemas.openxmlformats.org/wordprocessingml/2006/main">
+  <w:docDefaults>
+    <w:rPrDefault>
+      <w:rPr>
+        <w:rFonts w:ascii="Calibri" w:hAnsi="Calibri"/>
+        <w:sz w:val="22"/>
+        <w:szCs w:val="22"/>
+      </w:rPr>
+    </w:rPrDefault>
+  </w:docDefaults>
   <w:style w:type="paragraph" w:default="1" w:styleId="Normal">
     <w:name w:val="Normal"/>
     <w:qFormat/>
-    <w:rPr>
-      <w:sz w:val="22"/>
-    </w:rPr>
   </w:style>
   <w:style w:type="paragraph" w:styleId="Heading1">
     <w:name w:val="heading 1"/>
     <w:basedOn w:val="Normal"/>
     <w:next w:val="Normal"/>
-    <w:qFormat/>
+    <w:uiPriority w:val="9"/>
+    <w:qFormat/>
+    <w:pPr>
+      <w:spacing w:before="240" w:after="120"/>
+    </w:pPr>
     <w:rPr>
       <w:b/>
       <w:sz w:val="32"/>
+      <w:szCs w:val="32"/>
     </w:rPr>
   </w:style>
   <w:style w:type="paragraph" w:styleId="Heading2">
     <w:name w:val="heading 2"/>
     <w:basedOn w:val="Normal"/>
     <w:next w:val="Normal"/>
-    <w:qFormat/>
+    <w:uiPriority w:val="9"/>
+    <w:qFormat/>
+    <w:pPr>
+      <w:spacing w:before="200" w:after="80"/>
+    </w:pPr>
     <w:rPr>
       <w:b/>
-      <w:sz w:val="28"/>
+      <w:sz w:val="26"/>
+      <w:szCs w:val="26"/>
     </w:rPr>
   </w:style>
   <w:style w:type="paragraph" w:styleId="Heading3">
     <w:name w:val="heading 3"/>
     <w:basedOn w:val="Normal"/>
     <w:next w:val="Normal"/>
-    <w:qFormat/>
+    <w:uiPriority w:val="9"/>
+    <w:qFormat/>
+    <w:pPr>
+      <w:spacing w:before="160" w:after="60"/>
+    </w:pPr>
     <w:rPr>
       <w:b/>
       <w:sz w:val="24"/>
+      <w:szCs w:val="24"/>
     </w:rPr>
+  </w:style>
+  <w:style w:type="paragraph" w:styleId="ListBullet">
+    <w:name w:val="List Bullet"/>
+    <w:basedOn w:val="Normal"/>
+    <w:uiPriority w:val="34"/>
+    <w:qFormat/>
+    <w:pPr>
+      <w:ind w:left="720" w:hanging="360"/>
+      <w:spacing w:after="40"/>
+    </w:pPr>
   </w:style>
 </w:styles>
 </file>
</xml_diff>